<commit_message>
Add editable draw.io diagrams and polish Part-1 deliverables
- Export all four UML diagrams (use case, component, 2 sequence) as
  .drawio files, verified by rendering them in the draw.io viewer
- Fix component diagram routing (no crossing on authorization path)
- Reference draw.io sources in SRS and Architecture figure captions
- Keep tables and card headers together across PDF pages
- Add .gitattributes for consistent line endings

Co-Authored-By: Claude Sonnet 5.5 <noreply@anthropic.com>
</commit_message>
<xml_diff>
--- a/docs/output/Software_Architecture_and_Design.docx
+++ b/docs/output/Software_Architecture_and_Design.docx
@@ -1055,7 +1055,7 @@
           <w:i/>
           <w:sz w:val="18"/>
         </w:rPr>
-        <w:t>Figure 2 – UML Component Diagram</w:t>
+        <w:t>Figure 2 – UML Component Diagram (draw.io source: diagrams/component.drawio)</w:t>
       </w:r>
     </w:p>
     <w:p>
@@ -7581,7 +7581,7 @@
           <w:i/>
           <w:sz w:val="18"/>
         </w:rPr>
-        <w:t>Figure 3 – Sequence Diagram 1: Reserve Equipment Slot</w:t>
+        <w:t>Figure 3 – Sequence Diagram 1: Reserve Equipment Slot (draw.io source: diagrams/sequence-01.drawio)</w:t>
       </w:r>
     </w:p>
     <w:p>
@@ -7647,7 +7647,7 @@
           <w:i/>
           <w:sz w:val="18"/>
         </w:rPr>
-        <w:t>Figure 4 – Sequence Diagram 2: Return Equipment</w:t>
+        <w:t>Figure 4 – Sequence Diagram 2: Return Equipment (draw.io source: diagrams/sequence-02.drawio)</w:t>
       </w:r>
     </w:p>
     <w:p>

</xml_diff>